<commit_message>
Fix branding: K-Platform, not K-Point Platform
Corrects the product name across README, PLAN, TASK, CONTRIBUTING,
root package.json, the SRS docx generator (and regenerated binary),
and the Phase 0 placeholder frontend. The internal currency unit
"KPoint" is unaffected.

Co-Authored-By: Claude Sonnet 5 <noreply@anthropic.com>
Claude-Session: https://claude.ai/code/session_01LyF6cFAoyFaqJG1Thmdppz
</commit_message>
<xml_diff>
--- a/SRS_K-PLATFORM-v1.0.docx
+++ b/SRS_K-PLATFORM-v1.0.docx
@@ -65,7 +65,7 @@
           <w:sz w:val="56"/>
           <w:szCs w:val="56"/>
         </w:rPr>
-        <w:t xml:space="preserve">K-POINT PLATFORM</w:t>
+        <w:t xml:space="preserve">K-PLATFORM</w:t>
       </w:r>
     </w:p>
     <w:p>
@@ -246,7 +246,7 @@
                 <w:sz w:val="19"/>
                 <w:szCs w:val="19"/>
               </w:rPr>
-              <w:t xml:space="preserve">Nền tảng KPoint Platform (Web/App Cross-Platform)</w:t>
+              <w:t xml:space="preserve">Nền tảng K-Platform (Web/App Cross-Platform)</w:t>
             </w:r>
           </w:p>
         </w:tc>
@@ -758,7 +758,7 @@
                 <w:sz w:val="19"/>
                 <w:szCs w:val="19"/>
               </w:rPr>
-              <w:t xml:space="preserve">Nền tảng KPoint Platform (Web/App Cross-Platform)</w:t>
+              <w:t xml:space="preserve">Nền tảng K-Platform (Web/App Cross-Platform)</w:t>
             </w:r>
           </w:p>
         </w:tc>
@@ -9322,7 +9322,7 @@
           <w:sz w:val="18"/>
           <w:szCs w:val="18"/>
         </w:rPr>
-        <w:t xml:space="preserve">© 2026 K-Point Platform — Tài liệu nội bộ, bảo mật theo chính sách công ty.</w:t>
+        <w:t xml:space="preserve">© 2026 K-Platform — Tài liệu nội bộ, bảo mật theo chính sách công ty.</w:t>
       </w:r>
     </w:p>
     <w:sectPr>
@@ -9661,7 +9661,7 @@
         <w:sz w:val="20"/>
         <w:szCs w:val="20"/>
       </w:rPr>
-      <w:t xml:space="preserve">   K-POINT PLATFORM</w:t>
+      <w:t xml:space="preserve">   K-PLATFORM</w:t>
     </w:r>
     <w:r>
       <w:rPr>
@@ -9737,7 +9737,7 @@
         <w:sz w:val="20"/>
         <w:szCs w:val="20"/>
       </w:rPr>
-      <w:t xml:space="preserve">   K-POINT PLATFORM</w:t>
+      <w:t xml:space="preserve">   K-PLATFORM</w:t>
     </w:r>
     <w:r>
       <w:rPr>
@@ -9813,7 +9813,7 @@
         <w:sz w:val="20"/>
         <w:szCs w:val="20"/>
       </w:rPr>
-      <w:t xml:space="preserve">   K-POINT PLATFORM</w:t>
+      <w:t xml:space="preserve">   K-PLATFORM</w:t>
     </w:r>
     <w:r>
       <w:rPr>

</xml_diff>